<commit_message>
Add Chapter 4 (Feature Prototype) to preliminary report; sweep em dashes
Chapter 4 covers what the prototype does, evaluation method and
quantitative results on both test clips, observed failure modes
(bystander capture and close-range flicker), how the design
</commit_message>
<xml_diff>
--- a/final proj uol/prelim_report.docx
+++ b/final proj uol/prelim_report.docx
@@ -348,7 +348,7 @@
               <w:rPr>
                 <w:b/>
               </w:rPr>
-              <w:t xml:space="preserve">Client Layer  —  React single-page application</w:t>
+              <w:t xml:space="preserve">Client Layer  -  React single-page application</w:t>
             </w:r>
           </w:p>
           <w:p>
@@ -458,7 +458,7 @@
               <w:rPr>
                 <w:b/>
               </w:rPr>
-              <w:t xml:space="preserve">Application &amp; API Layer  —  FastAPI</w:t>
+              <w:t xml:space="preserve">Application &amp; API Layer  -  FastAPI</w:t>
             </w:r>
           </w:p>
           <w:p>
@@ -568,7 +568,7 @@
               <w:rPr>
                 <w:b/>
               </w:rPr>
-              <w:t xml:space="preserve">Processing &amp; AI Pipeline  —  background workers</w:t>
+              <w:t xml:space="preserve">Processing &amp; AI Pipeline  -  background workers</w:t>
             </w:r>
           </w:p>
           <w:p>
@@ -4002,6 +4002,181 @@
     <w:p>
       <w:r>
         <w:t xml:space="preserve">The design includes graceful fallbacks for its principal risks. If pose estimation proves too unreliable on fencing footage, the system falls back to detection and tracking combined with manual annotation, preserving its core value. If automatic event proposal underperforms, the result is no worse than a fully manual but still structured workflow. If integration of the language model proves problematic, summaries degrade gracefully to template-based textual statistics. The P9 buffer absorbs schedule slippage, and scope is protected by treating stretch features such as movement heatmaps, blade tracking and automatic action labelling as optional rather than core.</w:t>
+      </w:r>
+    </w:p>
+    <w:p>
+      <w:pPr>
+        <w:pStyle w:val="Heading1"/>
+      </w:pPr>
+      <w:r>
+        <w:t xml:space="preserve">4. Feature Prototype</w:t>
+      </w:r>
+    </w:p>
+    <w:p>
+      <w:r>
+        <w:t xml:space="preserve">To demonstrate the technical feasibility of the proposed system, a prototype was implemented that realises the foundational components of the AI processing pipeline described in Chapter 3. The prototype takes a recorded epee bout video as input and produces an annotated video, a per-frame metrics CSV, and a distance-over-time plot. It was scoped to the parts of the pipeline that everything else depends on: fencer detection and tracking, pose estimation, inter-fencer distance estimation, and a cumulative per-fencer push and pull metric. These were chosen because they are the foundation on which the planned event proposal, statistics, profiling, and language generation stages all build, and because the metrics they produce - particularly the distance and push/pull values - are the concrete realisation of the introduction’s claim that important tactical information is effectively impossible to measure by hand.</w:t>
+      </w:r>
+    </w:p>
+    <w:p>
+      <w:r>
+        <w:t/>
+      </w:r>
+    </w:p>
+    <w:p>
+      <w:pPr>
+        <w:spacing w:before="160" w:after="60"/>
+      </w:pPr>
+      <w:r>
+        <w:rPr>
+          <w:b/>
+          <w:sz w:val="26"/>
+        </w:rPr>
+        <w:t xml:space="preserve">4.1 What was implemented</w:t>
+      </w:r>
+    </w:p>
+    <w:p>
+      <w:r>
+        <w:t xml:space="preserve">The prototype is a Python command-line tool. For each frame it (1) runs YOLOv8 with the ByteTrack tracker to obtain person detections and identifiers; (2) passes those detections through a custom matcher that maintains two persistent Fencer 1 / Fencer 2 slots by spatial continuity, with spatial and size gates intended to reject obvious bystanders; (3) runs the MediaPipe PoseLandmarker (Tasks API) on each fencer crop to extract body keypoints; (4) computes distance front-foot to front-foot when pose is available, falling back to the bottom-centre of the bounding box otherwise, normalised to metres using the mean bounding-box height as a scale reference under the assumption of an average fencer height of 1.75 m; (5) accumulates each fencer’s horizontal displacement toward and away from the opponent as cumulative push and pull totals, using a rolling-median smoother on the reference x-coordinate, a per-frame biomechanical clamp at 0.15 m to suppress camera motion, and a noise floor at 0.03 m to suppress detection jitter.</w:t>
+      </w:r>
+    </w:p>
+    <w:p>
+      <w:r>
+        <w:t xml:space="preserve">Pose estimation, which is the dominant computational cost, is run by default every third frame; the distance pipeline falls back to the bounding-box method on the in-between frames. The output video shows bounding boxes with stable fencer labels, key pose landmarks, and a translucent bottom panel reporting the current distance (colour-coded by tactical zone: red within 1.0 m, orange within 1.8 m, green further out), the elapsed time, and the cumulative push and pull totals for each fencer. The prototype is supported by 55 unit tests written in pytest, covering the geometry helpers, pose helpers, the stateful identity matcher, the push and pull accumulator, and the rolling-median smoother.</w:t>
+      </w:r>
+    </w:p>
+    <w:p>
+      <w:r>
+        <w:t/>
+      </w:r>
+    </w:p>
+    <w:p>
+      <w:pPr>
+        <w:spacing w:before="160" w:after="60"/>
+      </w:pPr>
+      <w:r>
+        <w:rPr>
+          <w:b/>
+          <w:sz w:val="26"/>
+        </w:rPr>
+        <w:t xml:space="preserve">4.2 Evaluation method</w:t>
+      </w:r>
+    </w:p>
+    <w:p>
+      <w:r>
+        <w:t xml:space="preserve">The prototype was evaluated on two independently sourced FIE-level epee bout clips, each trimmed to three minutes of in-bout footage from publicly available recordings; attribution is given at the end of this chapter. Evaluation was both quantitative (frame coverage, distance and motion statistics) and qualitative (manual inspection of the annotated output video for identity stability and obvious failure modes). The two clips were deliberately chosen to differ in style of fencing, with the first relatively static and the second considerably more active, in order to test whether the metrics distinguish between bouts.</w:t>
+      </w:r>
+    </w:p>
+    <w:p>
+      <w:r>
+        <w:t/>
+      </w:r>
+    </w:p>
+    <w:p>
+      <w:pPr>
+        <w:spacing w:before="160" w:after="60"/>
+      </w:pPr>
+      <w:r>
+        <w:rPr>
+          <w:b/>
+          <w:sz w:val="26"/>
+        </w:rPr>
+        <w:t xml:space="preserve">4.3 Quantitative results</w:t>
+      </w:r>
+    </w:p>
+    <w:p>
+      <w:r>
+        <w:t xml:space="preserve">On the first clip (10,791 frames at 60 fps), both fencers were correctly detected and assigned to their stable slots in 82% of frames; pose-based distance was available for 32% of those (consistent with the pose stride of three). The mean inter-fencer distance was 2.26 m, with values ranging from 0.11 m to 6.60 m. Fencer 1 accumulated 14.2 m of push and 11.1 m of pull; Fencer 2 accumulated 15.8 m and 17.1 m.</w:t>
+      </w:r>
+    </w:p>
+    <w:p>
+      <w:r>
+        <w:t xml:space="preserve">On the second clip (9,000 frames), 87% of frames had both fencers detected. The mean distance was 3.33 m, with a range of 0.36 m to 8.45 m. Fencer 1 accumulated 41.0 m of push and 41.5 m of pull; Fencer 2 accumulated 36.8 m and 37.1 m. The fencers in this clip therefore performed roughly two to three times the footwork of those in the first clip, and engaged at a meaningfully wider average distance. This kind of cross-bout comparison is effectively impossible to produce by hand and is, in itself, the central demonstration of the prototype: the system already generates metrics that distinguish between bouts at a level of detail manual analysis cannot match.</w:t>
+      </w:r>
+    </w:p>
+    <w:p>
+      <w:r>
+        <w:t xml:space="preserve">The spatial and size gates added to the identity matcher had a measurable effect on data quality. On the first clip the maximum reported inter-fencer distance dropped from 11.27 m (matcher with no gates) to 6.60 m (with gates), confirming that the gates were filtering precisely the wrong-target detections that had been inflating distance estimates.</w:t>
+      </w:r>
+    </w:p>
+    <w:p>
+      <w:r>
+        <w:t/>
+      </w:r>
+    </w:p>
+    <w:p>
+      <w:pPr>
+        <w:spacing w:before="160" w:after="60"/>
+      </w:pPr>
+      <w:r>
+        <w:rPr>
+          <w:b/>
+          <w:sz w:val="26"/>
+        </w:rPr>
+        <w:t xml:space="preserve">4.4 Observed failure modes</w:t>
+      </w:r>
+    </w:p>
+    <w:p>
+      <w:r>
+        <w:t xml:space="preserve">Two failure modes were reproducibly observed and are recorded here in detail because their presence is itself a finding. Both are classical data-association failures in single-camera multi-object tracking and both are anticipated in the Chapter 3 design as the reason the system is AI-assisted rather than fully automatic.</w:t>
+      </w:r>
+    </w:p>
+    <w:p>
+      <w:r>
+        <w:t xml:space="preserve">The first failure mode is wrong-target capture by background people. The spatial gate rejects candidates that are too far from a slot’s last known position, and the size gate rejects candidates whose bounding-box height is far outside the slot’s recent band. The gates correctly filter the obvious cases. However, when a non-fencer such as the centre referee or a fencer on an adjacent piste happens to pass through a tracked slot’s last position, the candidate detection passes both gates; the slot’s history then updates to the wrong target, and the slot remains locked on the wrong person for as long as the wrong target stays close to it. This was reproducibly observed in the second clip during a walkback, when the centre referee stepped into Fencer 2’s last position. The deeper fixes (piste-region detection, motion modelling, or appearance re-identification) are real engineering tasks beyond the prototype’s scope and are recorded as future work.</w:t>
+      </w:r>
+    </w:p>
+    <w:p>
+      <w:r>
+        <w:t xml:space="preserve">The second failure mode is close-range identity flicker. When the two fencers cross or clinch within touch range, the YOLO detector frequently merges them into a single bounding box rather than returning two. The tracker then has only one detection to allocate; the other slot receives no update; and when the fencers separate again the two new boxes can be mis-assigned, especially if the cost-minimising match happens to be the swapped one. Background detections are also more likely to be admitted during these moments. The underlying cause - the detector’s box-level merging behaviour - is again best addressed by a motion model that remembers each fencer’s direction of travel immediately before the clinch and by piste-region filtering that excludes nearby spurious candidates.</w:t>
+      </w:r>
+    </w:p>
+    <w:p>
+      <w:r>
+        <w:t/>
+      </w:r>
+    </w:p>
+    <w:p>
+      <w:pPr>
+        <w:spacing w:before="160" w:after="60"/>
+      </w:pPr>
+      <w:r>
+        <w:rPr>
+          <w:b/>
+          <w:sz w:val="26"/>
+        </w:rPr>
+        <w:t xml:space="preserve">4.5 How the design accommodates these failures</w:t>
+      </w:r>
+    </w:p>
+    <w:p>
+      <w:r>
+        <w:t xml:space="preserve">The observed failures do not undermine the project concept; they are exactly the situations the proposed assisted-annotation workflow is designed to handle. The workflow exposes a small set of high-level user actions that resolve each problem at the level the user already thinks about a bout, rather than requiring per-frame correction. The user can: (1) confirm or correct AI-suggested touches, which establishes in-play exchange boundaries so that reset and walkback periods - precisely the situations in which background bystanders interfere - are excluded from aggregate metrics; (2) add a touch the AI missed; (3) mark a short segment as tracking-unreliable so that it is excluded from aggregates while the raw data is preserved; and (4) re-anchor a slot by clicking the correct fencer in a problem frame, resetting the tracker’s slot history from that frame onward. Most failures observed in this prototype are resolved by the first action alone, because they occur during the reset periods that the touch boundaries naturally exclude. The prototype’s failure modes therefore validate, in practice, the Chapter 3 design choice of AI-assisted rather than fully automatic tracking.</w:t>
+      </w:r>
+    </w:p>
+    <w:p>
+      <w:r>
+        <w:t/>
+      </w:r>
+    </w:p>
+    <w:p>
+      <w:pPr>
+        <w:spacing w:before="160" w:after="60"/>
+      </w:pPr>
+      <w:r>
+        <w:rPr>
+          <w:b/>
+          <w:sz w:val="26"/>
+        </w:rPr>
+        <w:t xml:space="preserve">4.6 Footage attribution</w:t>
+      </w:r>
+    </w:p>
+    <w:p>
+      <w:r>
+        <w:t xml:space="preserve">The two clips used to evaluate the prototype are publicly available recordings of FIE-level epee bouts on YouTube. They were used solely for non-commercial academic evaluation as part of this preliminary project and were not redistributed in any form. Each clip was trimmed locally and processed in a private workflow; no personally identifying information was extracted, stored or shared. The author claims no ownership of the original recordings and the original uploaders retain all rights. The use is consistent with limited educational fair use for the purpose of demonstrating a research prototype, and the videos themselves are not included in this submission.</w:t>
+      </w:r>
+    </w:p>
+    <w:p>
+      <w:r>
+        <w:t/>
       </w:r>
     </w:p>
     <w:p>

</xml_diff>

<commit_message>
Acknowledge side-on / stable-angle camera assumption in Chapter 4
Adds a short paragraph to Chapter 4 section 4.4 noting that the
front-foot logic and the pixel-to-metres normalisation both assume a
roughly side-on camera view at a stable angle, and that footage shot
</commit_message>
<xml_diff>
--- a/final proj uol/prelim_report.docx
+++ b/final proj uol/prelim_report.docx
@@ -4128,6 +4128,11 @@
     <w:p>
       <w:r>
         <w:t xml:space="preserve">The second failure mode is close-range identity flicker. When the two fencers cross or clinch within touch range, the YOLO detector frequently merges them into a single bounding box rather than returning two. The tracker then has only one detection to allocate; the other slot receives no update; and when the fencers separate again the two new boxes can be mis-assigned, especially if the cost-minimising match happens to be the swapped one. Background detections are also more likely to be admitted during these moments. The underlying cause - the detector’s box-level merging behaviour - is again best addressed by a motion model that remembers each fencer’s direction of travel immediately before the clinch and by piste-region filtering that excludes nearby spurious candidates.</w:t>
+      </w:r>
+    </w:p>
+    <w:p>
+      <w:r>
+        <w:t xml:space="preserve">Alongside these two reproducible failure modes, the prototype carries an implicit assumption that should be acknowledged: the front-foot identification logic and the pixel-to-metres normalisation both assume a roughly side-on camera view at a stable angle. Footage shot from one end of the piste, with significant zoom, or with substantial panning will distort the metric values systematically. The two test clips were chosen specifically for being close to a side-on, low-pan recording style; clip 1’s small residual panning was visibly absorbed by the per-frame motion clamp described in section 4.1. The full system will benefit from explicit camera-motion compensation, but the simpler practical mitigation is to choose recording angles deliberately when the system is used in earnest.</w:t>
       </w:r>
     </w:p>
     <w:p>

</xml_diff>